<commit_message>
Update ERD to final version
Co-Authored-By: Claude Opus 4.7 (1M context) <noreply@anthropic.com>
</commit_message>
<xml_diff>
--- a/ERD.docx
+++ b/ERD.docx
@@ -534,7 +534,23 @@
                 <w:b/>
                 <w:bCs/>
               </w:rPr>
-              <w:t>Match user need to nearby support resources</w:t>
+              <w:t xml:space="preserve">Match </w:t>
+            </w:r>
+            <w:proofErr w:type="gramStart"/>
+            <w:r>
+              <w:rPr>
+                <w:b/>
+                <w:bCs/>
+              </w:rPr>
+              <w:t>user</w:t>
+            </w:r>
+            <w:proofErr w:type="gramEnd"/>
+            <w:r>
+              <w:rPr>
+                <w:b/>
+                <w:bCs/>
+              </w:rPr>
+              <w:t xml:space="preserve"> need to nearby support resources</w:t>
             </w:r>
           </w:p>
         </w:tc>
@@ -3455,8 +3471,65 @@
           <w:b/>
           <w:bCs/>
         </w:rPr>
-        <w:t>Score = category_match + distance_score + cost_score + accessibility_score</w:t>
-      </w:r>
+        <w:t xml:space="preserve">Score = </w:t>
+      </w:r>
+      <w:proofErr w:type="spellStart"/>
+      <w:r>
+        <w:rPr>
+          <w:b/>
+          <w:bCs/>
+        </w:rPr>
+        <w:t>category_match</w:t>
+      </w:r>
+      <w:proofErr w:type="spellEnd"/>
+      <w:r>
+        <w:rPr>
+          <w:b/>
+          <w:bCs/>
+        </w:rPr>
+        <w:t xml:space="preserve"> + </w:t>
+      </w:r>
+      <w:proofErr w:type="spellStart"/>
+      <w:r>
+        <w:rPr>
+          <w:b/>
+          <w:bCs/>
+        </w:rPr>
+        <w:t>distance_score</w:t>
+      </w:r>
+      <w:proofErr w:type="spellEnd"/>
+      <w:r>
+        <w:rPr>
+          <w:b/>
+          <w:bCs/>
+        </w:rPr>
+        <w:t xml:space="preserve"> + </w:t>
+      </w:r>
+      <w:proofErr w:type="spellStart"/>
+      <w:r>
+        <w:rPr>
+          <w:b/>
+          <w:bCs/>
+        </w:rPr>
+        <w:t>cost_score</w:t>
+      </w:r>
+      <w:proofErr w:type="spellEnd"/>
+      <w:r>
+        <w:rPr>
+          <w:b/>
+          <w:bCs/>
+        </w:rPr>
+        <w:t xml:space="preserve"> + </w:t>
+      </w:r>
+      <w:proofErr w:type="spellStart"/>
+      <w:r>
+        <w:rPr>
+          <w:b/>
+          <w:bCs/>
+        </w:rPr>
+        <w:t>accessibility_score</w:t>
+      </w:r>
+      <w:proofErr w:type="spellEnd"/>
     </w:p>
     <w:p>
       <w:pPr>
@@ -7090,8 +7163,17 @@
                 <w:b/>
                 <w:bCs/>
               </w:rPr>
-              <w:t>SQLite, PostgreSQL, or Supabase</w:t>
-            </w:r>
+              <w:t xml:space="preserve">SQLite, PostgreSQL, or </w:t>
+            </w:r>
+            <w:proofErr w:type="spellStart"/>
+            <w:r>
+              <w:rPr>
+                <w:b/>
+                <w:bCs/>
+              </w:rPr>
+              <w:t>Supabase</w:t>
+            </w:r>
+            <w:proofErr w:type="spellEnd"/>
           </w:p>
         </w:tc>
       </w:tr>
@@ -7139,8 +7221,17 @@
                 <w:b/>
                 <w:bCs/>
               </w:rPr>
-              <w:t>Leaflet or Mapbox</w:t>
-            </w:r>
+              <w:t xml:space="preserve">Leaflet or </w:t>
+            </w:r>
+            <w:proofErr w:type="spellStart"/>
+            <w:r>
+              <w:rPr>
+                <w:b/>
+                <w:bCs/>
+              </w:rPr>
+              <w:t>Mapbox</w:t>
+            </w:r>
+            <w:proofErr w:type="spellEnd"/>
           </w:p>
         </w:tc>
       </w:tr>
@@ -7281,12 +7372,37 @@
                 <w:bCs/>
               </w:rPr>
             </w:pPr>
-            <w:r>
-              <w:rPr>
-                <w:b/>
-                <w:bCs/>
-              </w:rPr>
-              <w:t>Vercel + Supabase, or local demo</w:t>
+            <w:proofErr w:type="spellStart"/>
+            <w:r>
+              <w:rPr>
+                <w:b/>
+                <w:bCs/>
+              </w:rPr>
+              <w:t>Vercel</w:t>
+            </w:r>
+            <w:proofErr w:type="spellEnd"/>
+            <w:r>
+              <w:rPr>
+                <w:b/>
+                <w:bCs/>
+              </w:rPr>
+              <w:t xml:space="preserve"> + </w:t>
+            </w:r>
+            <w:proofErr w:type="spellStart"/>
+            <w:r>
+              <w:rPr>
+                <w:b/>
+                <w:bCs/>
+              </w:rPr>
+              <w:t>Supabase</w:t>
+            </w:r>
+            <w:proofErr w:type="spellEnd"/>
+            <w:r>
+              <w:rPr>
+                <w:b/>
+                <w:bCs/>
+              </w:rPr>
+              <w:t>, or local demo</w:t>
             </w:r>
           </w:p>
         </w:tc>
@@ -7336,8 +7452,17 @@
           <w:b/>
           <w:bCs/>
         </w:rPr>
-        <w:t>POST /checkins</w:t>
-      </w:r>
+        <w:t>POST /</w:t>
+      </w:r>
+      <w:proofErr w:type="spellStart"/>
+      <w:r>
+        <w:rPr>
+          <w:b/>
+          <w:bCs/>
+        </w:rPr>
+        <w:t>checkins</w:t>
+      </w:r>
+      <w:proofErr w:type="spellEnd"/>
     </w:p>
     <w:p>
       <w:pPr>
@@ -7396,7 +7521,32 @@
           <w:b/>
           <w:bCs/>
         </w:rPr>
-        <w:t xml:space="preserve">  "resident_id": "R001",</w:t>
+        <w:t xml:space="preserve">  "</w:t>
+      </w:r>
+      <w:proofErr w:type="spellStart"/>
+      <w:proofErr w:type="gramStart"/>
+      <w:r>
+        <w:rPr>
+          <w:b/>
+          <w:bCs/>
+        </w:rPr>
+        <w:t>resident</w:t>
+      </w:r>
+      <w:proofErr w:type="gramEnd"/>
+      <w:r>
+        <w:rPr>
+          <w:b/>
+          <w:bCs/>
+        </w:rPr>
+        <w:t>_id</w:t>
+      </w:r>
+      <w:proofErr w:type="spellEnd"/>
+      <w:r>
+        <w:rPr>
+          <w:b/>
+          <w:bCs/>
+        </w:rPr>
+        <w:t>": "R001",</w:t>
       </w:r>
     </w:p>
     <w:p>
@@ -7426,7 +7576,32 @@
           <w:b/>
           <w:bCs/>
         </w:rPr>
-        <w:t xml:space="preserve">  "age_band": "65+",</w:t>
+        <w:t xml:space="preserve">  "</w:t>
+      </w:r>
+      <w:proofErr w:type="spellStart"/>
+      <w:proofErr w:type="gramStart"/>
+      <w:r>
+        <w:rPr>
+          <w:b/>
+          <w:bCs/>
+        </w:rPr>
+        <w:t>age</w:t>
+      </w:r>
+      <w:proofErr w:type="gramEnd"/>
+      <w:r>
+        <w:rPr>
+          <w:b/>
+          <w:bCs/>
+        </w:rPr>
+        <w:t>_band</w:t>
+      </w:r>
+      <w:proofErr w:type="spellEnd"/>
+      <w:r>
+        <w:rPr>
+          <w:b/>
+          <w:bCs/>
+        </w:rPr>
+        <w:t>": "65+",</w:t>
       </w:r>
     </w:p>
     <w:p>
@@ -7456,22 +7631,72 @@
           <w:b/>
           <w:bCs/>
         </w:rPr>
-        <w:t xml:space="preserve">  "free_text": "I feel lonely and want something nearby",</w:t>
-      </w:r>
-    </w:p>
-    <w:p>
-      <w:pPr>
-        <w:rPr>
-          <w:b/>
-          <w:bCs/>
-        </w:rPr>
-      </w:pPr>
-      <w:r>
-        <w:rPr>
-          <w:b/>
-          <w:bCs/>
-        </w:rPr>
-        <w:t xml:space="preserve">  "input_channel": "text"</w:t>
+        <w:t xml:space="preserve">  "</w:t>
+      </w:r>
+      <w:proofErr w:type="spellStart"/>
+      <w:proofErr w:type="gramStart"/>
+      <w:r>
+        <w:rPr>
+          <w:b/>
+          <w:bCs/>
+        </w:rPr>
+        <w:t>free</w:t>
+      </w:r>
+      <w:proofErr w:type="gramEnd"/>
+      <w:r>
+        <w:rPr>
+          <w:b/>
+          <w:bCs/>
+        </w:rPr>
+        <w:t>_text</w:t>
+      </w:r>
+      <w:proofErr w:type="spellEnd"/>
+      <w:r>
+        <w:rPr>
+          <w:b/>
+          <w:bCs/>
+        </w:rPr>
+        <w:t>": "I feel lonely and want something nearby",</w:t>
+      </w:r>
+    </w:p>
+    <w:p>
+      <w:pPr>
+        <w:rPr>
+          <w:b/>
+          <w:bCs/>
+        </w:rPr>
+      </w:pPr>
+      <w:r>
+        <w:rPr>
+          <w:b/>
+          <w:bCs/>
+        </w:rPr>
+        <w:t xml:space="preserve">  "</w:t>
+      </w:r>
+      <w:proofErr w:type="spellStart"/>
+      <w:proofErr w:type="gramStart"/>
+      <w:r>
+        <w:rPr>
+          <w:b/>
+          <w:bCs/>
+        </w:rPr>
+        <w:t>input</w:t>
+      </w:r>
+      <w:proofErr w:type="gramEnd"/>
+      <w:r>
+        <w:rPr>
+          <w:b/>
+          <w:bCs/>
+        </w:rPr>
+        <w:t>_channel</w:t>
+      </w:r>
+      <w:proofErr w:type="spellEnd"/>
+      <w:r>
+        <w:rPr>
+          <w:b/>
+          <w:bCs/>
+        </w:rPr>
+        <w:t>": "text"</w:t>
       </w:r>
     </w:p>
     <w:p>
@@ -7531,22 +7756,88 @@
           <w:b/>
           <w:bCs/>
         </w:rPr>
-        <w:t xml:space="preserve">  "checkin_id": "C001",</w:t>
-      </w:r>
-    </w:p>
-    <w:p>
-      <w:pPr>
-        <w:rPr>
-          <w:b/>
-          <w:bCs/>
-        </w:rPr>
-      </w:pPr>
-      <w:r>
-        <w:rPr>
-          <w:b/>
-          <w:bCs/>
-        </w:rPr>
-        <w:t xml:space="preserve">  "need_type": "social_connection",</w:t>
+        <w:t xml:space="preserve">  "</w:t>
+      </w:r>
+      <w:proofErr w:type="spellStart"/>
+      <w:proofErr w:type="gramStart"/>
+      <w:r>
+        <w:rPr>
+          <w:b/>
+          <w:bCs/>
+        </w:rPr>
+        <w:t>checkin</w:t>
+      </w:r>
+      <w:proofErr w:type="gramEnd"/>
+      <w:r>
+        <w:rPr>
+          <w:b/>
+          <w:bCs/>
+        </w:rPr>
+        <w:t>_id</w:t>
+      </w:r>
+      <w:proofErr w:type="spellEnd"/>
+      <w:r>
+        <w:rPr>
+          <w:b/>
+          <w:bCs/>
+        </w:rPr>
+        <w:t>": "C001",</w:t>
+      </w:r>
+    </w:p>
+    <w:p>
+      <w:pPr>
+        <w:rPr>
+          <w:b/>
+          <w:bCs/>
+        </w:rPr>
+      </w:pPr>
+      <w:r>
+        <w:rPr>
+          <w:b/>
+          <w:bCs/>
+        </w:rPr>
+        <w:t xml:space="preserve">  "</w:t>
+      </w:r>
+      <w:proofErr w:type="spellStart"/>
+      <w:proofErr w:type="gramStart"/>
+      <w:r>
+        <w:rPr>
+          <w:b/>
+          <w:bCs/>
+        </w:rPr>
+        <w:t>need</w:t>
+      </w:r>
+      <w:proofErr w:type="gramEnd"/>
+      <w:r>
+        <w:rPr>
+          <w:b/>
+          <w:bCs/>
+        </w:rPr>
+        <w:t>_type</w:t>
+      </w:r>
+      <w:proofErr w:type="spellEnd"/>
+      <w:r>
+        <w:rPr>
+          <w:b/>
+          <w:bCs/>
+        </w:rPr>
+        <w:t>": "</w:t>
+      </w:r>
+      <w:proofErr w:type="spellStart"/>
+      <w:r>
+        <w:rPr>
+          <w:b/>
+          <w:bCs/>
+        </w:rPr>
+        <w:t>social_connection</w:t>
+      </w:r>
+      <w:proofErr w:type="spellEnd"/>
+      <w:r>
+        <w:rPr>
+          <w:b/>
+          <w:bCs/>
+        </w:rPr>
+        <w:t>",</w:t>
       </w:r>
     </w:p>
     <w:p>
@@ -7591,7 +7882,32 @@
           <w:b/>
           <w:bCs/>
         </w:rPr>
-        <w:t xml:space="preserve">      "service_name": "Carlton Community Centre",</w:t>
+        <w:t xml:space="preserve">      "</w:t>
+      </w:r>
+      <w:proofErr w:type="spellStart"/>
+      <w:proofErr w:type="gramStart"/>
+      <w:r>
+        <w:rPr>
+          <w:b/>
+          <w:bCs/>
+        </w:rPr>
+        <w:t>service</w:t>
+      </w:r>
+      <w:proofErr w:type="gramEnd"/>
+      <w:r>
+        <w:rPr>
+          <w:b/>
+          <w:bCs/>
+        </w:rPr>
+        <w:t>_name</w:t>
+      </w:r>
+      <w:proofErr w:type="spellEnd"/>
+      <w:r>
+        <w:rPr>
+          <w:b/>
+          <w:bCs/>
+        </w:rPr>
+        <w:t>": "Carlton Community Centre",</w:t>
       </w:r>
     </w:p>
     <w:p>
@@ -7621,7 +7937,32 @@
           <w:b/>
           <w:bCs/>
         </w:rPr>
-        <w:t xml:space="preserve">      "distance_km": 0.8</w:t>
+        <w:t xml:space="preserve">      "</w:t>
+      </w:r>
+      <w:proofErr w:type="spellStart"/>
+      <w:proofErr w:type="gramStart"/>
+      <w:r>
+        <w:rPr>
+          <w:b/>
+          <w:bCs/>
+        </w:rPr>
+        <w:t>distance</w:t>
+      </w:r>
+      <w:proofErr w:type="gramEnd"/>
+      <w:r>
+        <w:rPr>
+          <w:b/>
+          <w:bCs/>
+        </w:rPr>
+        <w:t>_km</w:t>
+      </w:r>
+      <w:proofErr w:type="spellEnd"/>
+      <w:r>
+        <w:rPr>
+          <w:b/>
+          <w:bCs/>
+        </w:rPr>
+        <w:t>": 0.8</w:t>
       </w:r>
     </w:p>
     <w:p>
@@ -7736,13 +8077,31 @@
           <w:bCs/>
         </w:rPr>
       </w:pPr>
-      <w:r>
-        <w:rPr>
-          <w:b/>
-          <w:bCs/>
-        </w:rPr>
-        <w:t>need_type=social_connection</w:t>
-      </w:r>
+      <w:proofErr w:type="spellStart"/>
+      <w:r>
+        <w:rPr>
+          <w:b/>
+          <w:bCs/>
+        </w:rPr>
+        <w:t>need_type</w:t>
+      </w:r>
+      <w:proofErr w:type="spellEnd"/>
+      <w:r>
+        <w:rPr>
+          <w:b/>
+          <w:bCs/>
+        </w:rPr>
+        <w:t>=</w:t>
+      </w:r>
+      <w:proofErr w:type="spellStart"/>
+      <w:r>
+        <w:rPr>
+          <w:b/>
+          <w:bCs/>
+        </w:rPr>
+        <w:t>social_connection</w:t>
+      </w:r>
+      <w:proofErr w:type="spellEnd"/>
     </w:p>
     <w:p>
       <w:pPr>
@@ -7831,52 +8190,168 @@
           <w:b/>
           <w:bCs/>
         </w:rPr>
-        <w:t xml:space="preserve">  "total_checkins": 42,</w:t>
-      </w:r>
-    </w:p>
-    <w:p>
-      <w:pPr>
-        <w:rPr>
-          <w:b/>
-          <w:bCs/>
-        </w:rPr>
-      </w:pPr>
-      <w:r>
-        <w:rPr>
-          <w:b/>
-          <w:bCs/>
-        </w:rPr>
-        <w:t xml:space="preserve">  "top_need": "social_connection",</w:t>
-      </w:r>
-    </w:p>
-    <w:p>
-      <w:pPr>
-        <w:rPr>
-          <w:b/>
-          <w:bCs/>
-        </w:rPr>
-      </w:pPr>
-      <w:r>
-        <w:rPr>
-          <w:b/>
-          <w:bCs/>
-        </w:rPr>
-        <w:t xml:space="preserve">  "connection_gap_score": "High",</w:t>
-      </w:r>
-    </w:p>
-    <w:p>
-      <w:pPr>
-        <w:rPr>
-          <w:b/>
-          <w:bCs/>
-        </w:rPr>
-      </w:pPr>
-      <w:r>
-        <w:rPr>
-          <w:b/>
-          <w:bCs/>
-        </w:rPr>
-        <w:t xml:space="preserve">  "recommended_action": "Promote low-cost social events and volunteer outreach"</w:t>
+        <w:t xml:space="preserve">  "</w:t>
+      </w:r>
+      <w:proofErr w:type="spellStart"/>
+      <w:proofErr w:type="gramStart"/>
+      <w:r>
+        <w:rPr>
+          <w:b/>
+          <w:bCs/>
+        </w:rPr>
+        <w:t>total</w:t>
+      </w:r>
+      <w:proofErr w:type="gramEnd"/>
+      <w:r>
+        <w:rPr>
+          <w:b/>
+          <w:bCs/>
+        </w:rPr>
+        <w:t>_checkins</w:t>
+      </w:r>
+      <w:proofErr w:type="spellEnd"/>
+      <w:r>
+        <w:rPr>
+          <w:b/>
+          <w:bCs/>
+        </w:rPr>
+        <w:t>": 42,</w:t>
+      </w:r>
+    </w:p>
+    <w:p>
+      <w:pPr>
+        <w:rPr>
+          <w:b/>
+          <w:bCs/>
+        </w:rPr>
+      </w:pPr>
+      <w:r>
+        <w:rPr>
+          <w:b/>
+          <w:bCs/>
+        </w:rPr>
+        <w:t xml:space="preserve">  "</w:t>
+      </w:r>
+      <w:proofErr w:type="spellStart"/>
+      <w:proofErr w:type="gramStart"/>
+      <w:r>
+        <w:rPr>
+          <w:b/>
+          <w:bCs/>
+        </w:rPr>
+        <w:t>top</w:t>
+      </w:r>
+      <w:proofErr w:type="gramEnd"/>
+      <w:r>
+        <w:rPr>
+          <w:b/>
+          <w:bCs/>
+        </w:rPr>
+        <w:t>_need</w:t>
+      </w:r>
+      <w:proofErr w:type="spellEnd"/>
+      <w:r>
+        <w:rPr>
+          <w:b/>
+          <w:bCs/>
+        </w:rPr>
+        <w:t>": "</w:t>
+      </w:r>
+      <w:proofErr w:type="spellStart"/>
+      <w:r>
+        <w:rPr>
+          <w:b/>
+          <w:bCs/>
+        </w:rPr>
+        <w:t>social_connection</w:t>
+      </w:r>
+      <w:proofErr w:type="spellEnd"/>
+      <w:r>
+        <w:rPr>
+          <w:b/>
+          <w:bCs/>
+        </w:rPr>
+        <w:t>",</w:t>
+      </w:r>
+    </w:p>
+    <w:p>
+      <w:pPr>
+        <w:rPr>
+          <w:b/>
+          <w:bCs/>
+        </w:rPr>
+      </w:pPr>
+      <w:r>
+        <w:rPr>
+          <w:b/>
+          <w:bCs/>
+        </w:rPr>
+        <w:t xml:space="preserve">  "</w:t>
+      </w:r>
+      <w:proofErr w:type="spellStart"/>
+      <w:proofErr w:type="gramStart"/>
+      <w:r>
+        <w:rPr>
+          <w:b/>
+          <w:bCs/>
+        </w:rPr>
+        <w:t>connection</w:t>
+      </w:r>
+      <w:proofErr w:type="gramEnd"/>
+      <w:r>
+        <w:rPr>
+          <w:b/>
+          <w:bCs/>
+        </w:rPr>
+        <w:t>_gap_score</w:t>
+      </w:r>
+      <w:proofErr w:type="spellEnd"/>
+      <w:r>
+        <w:rPr>
+          <w:b/>
+          <w:bCs/>
+        </w:rPr>
+        <w:t>": "High",</w:t>
+      </w:r>
+    </w:p>
+    <w:p>
+      <w:pPr>
+        <w:rPr>
+          <w:b/>
+          <w:bCs/>
+        </w:rPr>
+      </w:pPr>
+      <w:r>
+        <w:rPr>
+          <w:b/>
+          <w:bCs/>
+        </w:rPr>
+        <w:t xml:space="preserve">  "</w:t>
+      </w:r>
+      <w:proofErr w:type="spellStart"/>
+      <w:proofErr w:type="gramStart"/>
+      <w:r>
+        <w:rPr>
+          <w:b/>
+          <w:bCs/>
+        </w:rPr>
+        <w:t>recommended</w:t>
+      </w:r>
+      <w:proofErr w:type="gramEnd"/>
+      <w:r>
+        <w:rPr>
+          <w:b/>
+          <w:bCs/>
+        </w:rPr>
+        <w:t>_action</w:t>
+      </w:r>
+      <w:proofErr w:type="spellEnd"/>
+      <w:r>
+        <w:rPr>
+          <w:b/>
+          <w:bCs/>
+        </w:rPr>
+        <w:t>": "Promote low-cost social events and volunteer outreach"</w:t>
       </w:r>
     </w:p>
     <w:p>
@@ -8073,6 +8548,7 @@
                 <w:bCs/>
               </w:rPr>
             </w:pPr>
+            <w:proofErr w:type="spellStart"/>
             <w:r>
               <w:rPr>
                 <w:b/>
@@ -8080,6 +8556,7 @@
               </w:rPr>
               <w:t>checkins</w:t>
             </w:r>
+            <w:proofErr w:type="spellEnd"/>
           </w:p>
         </w:tc>
         <w:tc>
@@ -8122,6 +8599,7 @@
                 <w:bCs/>
               </w:rPr>
             </w:pPr>
+            <w:proofErr w:type="spellStart"/>
             <w:r>
               <w:rPr>
                 <w:b/>
@@ -8129,6 +8607,7 @@
               </w:rPr>
               <w:t>need_types</w:t>
             </w:r>
+            <w:proofErr w:type="spellEnd"/>
           </w:p>
         </w:tc>
         <w:tc>
@@ -8171,6 +8650,7 @@
                 <w:bCs/>
               </w:rPr>
             </w:pPr>
+            <w:proofErr w:type="spellStart"/>
             <w:r>
               <w:rPr>
                 <w:b/>
@@ -8178,6 +8658,7 @@
               </w:rPr>
               <w:t>support_services</w:t>
             </w:r>
+            <w:proofErr w:type="spellEnd"/>
           </w:p>
         </w:tc>
         <w:tc>
@@ -8220,6 +8701,7 @@
                 <w:bCs/>
               </w:rPr>
             </w:pPr>
+            <w:proofErr w:type="spellStart"/>
             <w:r>
               <w:rPr>
                 <w:b/>
@@ -8227,6 +8709,7 @@
               </w:rPr>
               <w:t>service_categories</w:t>
             </w:r>
+            <w:proofErr w:type="spellEnd"/>
           </w:p>
         </w:tc>
         <w:tc>
@@ -8367,6 +8850,7 @@
                 <w:bCs/>
               </w:rPr>
             </w:pPr>
+            <w:proofErr w:type="spellStart"/>
             <w:r>
               <w:rPr>
                 <w:b/>
@@ -8374,6 +8858,7 @@
               </w:rPr>
               <w:t>area_profiles</w:t>
             </w:r>
+            <w:proofErr w:type="spellEnd"/>
           </w:p>
         </w:tc>
         <w:tc>
@@ -8416,6 +8901,7 @@
                 <w:bCs/>
               </w:rPr>
             </w:pPr>
+            <w:proofErr w:type="spellStart"/>
             <w:r>
               <w:rPr>
                 <w:b/>
@@ -8423,6 +8909,7 @@
               </w:rPr>
               <w:t>area_insights</w:t>
             </w:r>
+            <w:proofErr w:type="spellEnd"/>
           </w:p>
         </w:tc>
         <w:tc>
@@ -10332,6 +10819,2375 @@
           <w:bCs/>
         </w:rPr>
         <w:t>That is the engineering goal.</w:t>
+      </w:r>
+    </w:p>
+    <w:p>
+      <w:pPr>
+        <w:rPr>
+          <w:b/>
+          <w:bCs/>
+        </w:rPr>
+      </w:pPr>
+    </w:p>
+    <w:p>
+      <w:pPr>
+        <w:rPr>
+          <w:b/>
+          <w:bCs/>
+        </w:rPr>
+      </w:pPr>
+      <w:r>
+        <w:rPr>
+          <w:b/>
+          <w:bCs/>
+        </w:rPr>
+        <w:t>Example of pulling Melbourne data</w:t>
+      </w:r>
+    </w:p>
+    <w:p>
+      <w:pPr>
+        <w:rPr>
+          <w:b/>
+          <w:bCs/>
+        </w:rPr>
+      </w:pPr>
+      <w:proofErr w:type="gramStart"/>
+      <w:r>
+        <w:rPr>
+          <w:b/>
+          <w:bCs/>
+        </w:rPr>
+        <w:t>#!/</w:t>
+      </w:r>
+      <w:proofErr w:type="gramEnd"/>
+      <w:r>
+        <w:rPr>
+          <w:b/>
+          <w:bCs/>
+        </w:rPr>
+        <w:t>usr/bin/env python3</w:t>
+      </w:r>
+    </w:p>
+    <w:p>
+      <w:pPr>
+        <w:rPr>
+          <w:b/>
+          <w:bCs/>
+        </w:rPr>
+      </w:pPr>
+      <w:r>
+        <w:rPr>
+          <w:b/>
+          <w:bCs/>
+        </w:rPr>
+        <w:t>"""</w:t>
+      </w:r>
+    </w:p>
+    <w:p>
+      <w:pPr>
+        <w:rPr>
+          <w:b/>
+          <w:bCs/>
+        </w:rPr>
+      </w:pPr>
+      <w:r>
+        <w:rPr>
+          <w:b/>
+          <w:bCs/>
+        </w:rPr>
+        <w:t>prefetch_melbourne.py</w:t>
+      </w:r>
+    </w:p>
+    <w:p>
+      <w:pPr>
+        <w:rPr>
+          <w:b/>
+          <w:bCs/>
+        </w:rPr>
+      </w:pPr>
+      <w:r>
+        <w:rPr>
+          <w:b/>
+          <w:bCs/>
+        </w:rPr>
+        <w:t>=====================</w:t>
+      </w:r>
+    </w:p>
+    <w:p>
+      <w:pPr>
+        <w:rPr>
+          <w:b/>
+          <w:bCs/>
+        </w:rPr>
+      </w:pPr>
+      <w:r>
+        <w:rPr>
+          <w:b/>
+          <w:bCs/>
+        </w:rPr>
+        <w:t>Pre-fetch + cache City of Melbourne open data for a hackathon, and TEST three</w:t>
+      </w:r>
+    </w:p>
+    <w:p>
+      <w:pPr>
+        <w:rPr>
+          <w:b/>
+          <w:bCs/>
+        </w:rPr>
+      </w:pPr>
+      <w:r>
+        <w:rPr>
+          <w:b/>
+          <w:bCs/>
+        </w:rPr>
+        <w:t>demo addresses by reporting how much data sits within walking distance of each.</w:t>
+      </w:r>
+    </w:p>
+    <w:p>
+      <w:pPr>
+        <w:rPr>
+          <w:b/>
+          <w:bCs/>
+        </w:rPr>
+      </w:pPr>
+    </w:p>
+    <w:p>
+      <w:pPr>
+        <w:rPr>
+          <w:b/>
+          <w:bCs/>
+        </w:rPr>
+      </w:pPr>
+      <w:r>
+        <w:rPr>
+          <w:b/>
+          <w:bCs/>
+        </w:rPr>
+        <w:t>Why this exists: on hackathon day the public API gets slow/flaky under load.</w:t>
+      </w:r>
+    </w:p>
+    <w:p>
+      <w:pPr>
+        <w:rPr>
+          <w:b/>
+          <w:bCs/>
+        </w:rPr>
+      </w:pPr>
+      <w:r>
+        <w:rPr>
+          <w:b/>
+          <w:bCs/>
+        </w:rPr>
+        <w:t>Run this the night before. It writes JSON snapshots you can fall back to so your</w:t>
+      </w:r>
+    </w:p>
+    <w:p>
+      <w:pPr>
+        <w:rPr>
+          <w:b/>
+          <w:bCs/>
+        </w:rPr>
+      </w:pPr>
+      <w:r>
+        <w:rPr>
+          <w:b/>
+          <w:bCs/>
+        </w:rPr>
+        <w:t>demo never shows an empty screen.</w:t>
+      </w:r>
+    </w:p>
+    <w:p>
+      <w:pPr>
+        <w:rPr>
+          <w:b/>
+          <w:bCs/>
+        </w:rPr>
+      </w:pPr>
+    </w:p>
+    <w:p>
+      <w:pPr>
+        <w:rPr>
+          <w:b/>
+          <w:bCs/>
+        </w:rPr>
+      </w:pPr>
+      <w:r>
+        <w:rPr>
+          <w:b/>
+          <w:bCs/>
+        </w:rPr>
+        <w:t>USAGE</w:t>
+      </w:r>
+    </w:p>
+    <w:p>
+      <w:pPr>
+        <w:rPr>
+          <w:b/>
+          <w:bCs/>
+        </w:rPr>
+      </w:pPr>
+      <w:r>
+        <w:rPr>
+          <w:b/>
+          <w:bCs/>
+        </w:rPr>
+        <w:t>-----</w:t>
+      </w:r>
+    </w:p>
+    <w:p>
+      <w:pPr>
+        <w:rPr>
+          <w:b/>
+          <w:bCs/>
+        </w:rPr>
+      </w:pPr>
+      <w:r>
+        <w:rPr>
+          <w:b/>
+          <w:bCs/>
+        </w:rPr>
+        <w:t xml:space="preserve">    python3 prefetch_melbourne.py</w:t>
+      </w:r>
+    </w:p>
+    <w:p>
+      <w:pPr>
+        <w:rPr>
+          <w:b/>
+          <w:bCs/>
+        </w:rPr>
+      </w:pPr>
+    </w:p>
+    <w:p>
+      <w:pPr>
+        <w:rPr>
+          <w:b/>
+          <w:bCs/>
+        </w:rPr>
+      </w:pPr>
+      <w:r>
+        <w:rPr>
+          <w:b/>
+          <w:bCs/>
+        </w:rPr>
+        <w:t>No dependencies beyond the Python 3 standard library. No API key required for</w:t>
+      </w:r>
+    </w:p>
+    <w:p>
+      <w:pPr>
+        <w:rPr>
+          <w:b/>
+          <w:bCs/>
+        </w:rPr>
+      </w:pPr>
+      <w:r>
+        <w:rPr>
+          <w:b/>
+          <w:bCs/>
+        </w:rPr>
+        <w:t>public datasets (set COM_APIKEY env var if you ever need one).</w:t>
+      </w:r>
+    </w:p>
+    <w:p>
+      <w:pPr>
+        <w:rPr>
+          <w:b/>
+          <w:bCs/>
+        </w:rPr>
+      </w:pPr>
+    </w:p>
+    <w:p>
+      <w:pPr>
+        <w:rPr>
+          <w:b/>
+          <w:bCs/>
+        </w:rPr>
+      </w:pPr>
+      <w:r>
+        <w:rPr>
+          <w:b/>
+          <w:bCs/>
+        </w:rPr>
+        <w:t>WHAT IT DOES</w:t>
+      </w:r>
+    </w:p>
+    <w:p>
+      <w:pPr>
+        <w:rPr>
+          <w:b/>
+          <w:bCs/>
+        </w:rPr>
+      </w:pPr>
+      <w:r>
+        <w:rPr>
+          <w:b/>
+          <w:bCs/>
+        </w:rPr>
+        <w:t>------------</w:t>
+      </w:r>
+    </w:p>
+    <w:p>
+      <w:pPr>
+        <w:rPr>
+          <w:b/>
+          <w:bCs/>
+        </w:rPr>
+      </w:pPr>
+      <w:r>
+        <w:rPr>
+          <w:b/>
+          <w:bCs/>
+        </w:rPr>
+        <w:t xml:space="preserve">1. Pulls the full dataset catalogue (authoritative </w:t>
+      </w:r>
+      <w:proofErr w:type="spellStart"/>
+      <w:r>
+        <w:rPr>
+          <w:b/>
+          <w:bCs/>
+        </w:rPr>
+        <w:t>dataset_ids</w:t>
+      </w:r>
+      <w:proofErr w:type="spellEnd"/>
+      <w:r>
+        <w:rPr>
+          <w:b/>
+          <w:bCs/>
+        </w:rPr>
+        <w:t>) so it can</w:t>
+      </w:r>
+    </w:p>
+    <w:p>
+      <w:pPr>
+        <w:rPr>
+          <w:b/>
+          <w:bCs/>
+        </w:rPr>
+      </w:pPr>
+      <w:r>
+        <w:rPr>
+          <w:b/>
+          <w:bCs/>
+        </w:rPr>
+        <w:t xml:space="preserve">   self-heal if any hard-coded slug is wrong.</w:t>
+      </w:r>
+    </w:p>
+    <w:p>
+      <w:pPr>
+        <w:rPr>
+          <w:b/>
+          <w:bCs/>
+        </w:rPr>
+      </w:pPr>
+      <w:r>
+        <w:rPr>
+          <w:b/>
+          <w:bCs/>
+        </w:rPr>
+        <w:t>2. Caches a 100-record sample of each priority dataset (the most-connected</w:t>
+      </w:r>
+    </w:p>
+    <w:p>
+      <w:pPr>
+        <w:rPr>
+          <w:b/>
+          <w:bCs/>
+        </w:rPr>
+      </w:pPr>
+      <w:r>
+        <w:rPr>
+          <w:b/>
+          <w:bCs/>
+        </w:rPr>
+        <w:t xml:space="preserve">   nodes on the linkage map + every live feed).</w:t>
+      </w:r>
+    </w:p>
+    <w:p>
+      <w:pPr>
+        <w:rPr>
+          <w:b/>
+          <w:bCs/>
+        </w:rPr>
+      </w:pPr>
+      <w:r>
+        <w:rPr>
+          <w:b/>
+          <w:bCs/>
+        </w:rPr>
+        <w:t>3. Grabs fresh snapshots of the near-real-time feeds (pedestrian-per-minute,</w:t>
+      </w:r>
+    </w:p>
+    <w:p>
+      <w:pPr>
+        <w:rPr>
+          <w:b/>
+          <w:bCs/>
+        </w:rPr>
+      </w:pPr>
+      <w:r>
+        <w:rPr>
+          <w:b/>
+          <w:bCs/>
+        </w:rPr>
+        <w:t xml:space="preserve">   parking sensors, microclimate).</w:t>
+      </w:r>
+    </w:p>
+    <w:p>
+      <w:pPr>
+        <w:rPr>
+          <w:b/>
+          <w:bCs/>
+        </w:rPr>
+      </w:pPr>
+      <w:r>
+        <w:rPr>
+          <w:b/>
+          <w:bCs/>
+        </w:rPr>
+        <w:t>4. For each of 3 demo addresses, runs proximity queries across the geospatial</w:t>
+      </w:r>
+    </w:p>
+    <w:p>
+      <w:pPr>
+        <w:rPr>
+          <w:b/>
+          <w:bCs/>
+        </w:rPr>
+      </w:pPr>
+      <w:r>
+        <w:rPr>
+          <w:b/>
+          <w:bCs/>
+        </w:rPr>
+        <w:t xml:space="preserve">   datasets and prints a density report -&gt; this is the "test" of the addresses.</w:t>
+      </w:r>
+    </w:p>
+    <w:p>
+      <w:pPr>
+        <w:rPr>
+          <w:b/>
+          <w:bCs/>
+        </w:rPr>
+      </w:pPr>
+      <w:r>
+        <w:rPr>
+          <w:b/>
+          <w:bCs/>
+        </w:rPr>
+        <w:t xml:space="preserve">5. Writes everything </w:t>
+      </w:r>
+      <w:proofErr w:type="gramStart"/>
+      <w:r>
+        <w:rPr>
+          <w:b/>
+          <w:bCs/>
+        </w:rPr>
+        <w:t>under .</w:t>
+      </w:r>
+      <w:proofErr w:type="gramEnd"/>
+      <w:r>
+        <w:rPr>
+          <w:b/>
+          <w:bCs/>
+        </w:rPr>
+        <w:t xml:space="preserve">/cache/ plus a </w:t>
+      </w:r>
+      <w:proofErr w:type="spellStart"/>
+      <w:proofErr w:type="gramStart"/>
+      <w:r>
+        <w:rPr>
+          <w:b/>
+          <w:bCs/>
+        </w:rPr>
+        <w:t>manifest.json</w:t>
+      </w:r>
+      <w:proofErr w:type="spellEnd"/>
+      <w:proofErr w:type="gramEnd"/>
+      <w:r>
+        <w:rPr>
+          <w:b/>
+          <w:bCs/>
+        </w:rPr>
+        <w:t xml:space="preserve"> describing the run.</w:t>
+      </w:r>
+    </w:p>
+    <w:p>
+      <w:pPr>
+        <w:rPr>
+          <w:b/>
+          <w:bCs/>
+        </w:rPr>
+      </w:pPr>
+    </w:p>
+    <w:p>
+      <w:pPr>
+        <w:rPr>
+          <w:b/>
+          <w:bCs/>
+        </w:rPr>
+      </w:pPr>
+      <w:r>
+        <w:rPr>
+          <w:b/>
+          <w:bCs/>
+        </w:rPr>
+        <w:t>VERIFIED DATASET TOTALS (from pre-hackathon run)</w:t>
+      </w:r>
+    </w:p>
+    <w:p>
+      <w:pPr>
+        <w:rPr>
+          <w:b/>
+          <w:bCs/>
+        </w:rPr>
+      </w:pPr>
+      <w:r>
+        <w:rPr>
+          <w:b/>
+          <w:bCs/>
+        </w:rPr>
+        <w:t>-------------------------------------------------</w:t>
+      </w:r>
+    </w:p>
+    <w:p>
+      <w:pPr>
+        <w:rPr>
+          <w:b/>
+          <w:bCs/>
+        </w:rPr>
+      </w:pPr>
+      <w:r>
+        <w:rPr>
+          <w:b/>
+          <w:bCs/>
+        </w:rPr>
+        <w:t>pedestrian-counting-system-monthly-counts-per-</w:t>
+      </w:r>
+      <w:proofErr w:type="gramStart"/>
+      <w:r>
+        <w:rPr>
+          <w:b/>
+          <w:bCs/>
+        </w:rPr>
+        <w:t>hour  1,573,618</w:t>
+      </w:r>
+      <w:proofErr w:type="gramEnd"/>
+      <w:r>
+        <w:rPr>
+          <w:b/>
+          <w:bCs/>
+        </w:rPr>
+        <w:t xml:space="preserve"> hourly records</w:t>
+      </w:r>
+    </w:p>
+    <w:p>
+      <w:pPr>
+        <w:rPr>
+          <w:b/>
+          <w:bCs/>
+        </w:rPr>
+      </w:pPr>
+      <w:r>
+        <w:rPr>
+          <w:b/>
+          <w:bCs/>
+        </w:rPr>
+        <w:t>trees-with-species-and-dimensions-urban-forest          82,064 trees</w:t>
+      </w:r>
+    </w:p>
+    <w:p>
+      <w:pPr>
+        <w:rPr>
+          <w:b/>
+          <w:bCs/>
+        </w:rPr>
+      </w:pPr>
+      <w:r>
+        <w:rPr>
+          <w:b/>
+          <w:bCs/>
+        </w:rPr>
+        <w:t>customer-service-requests-with-resolution-time          46,479 requests</w:t>
+      </w:r>
+    </w:p>
+    <w:p>
+      <w:pPr>
+        <w:rPr>
+          <w:b/>
+          <w:bCs/>
+        </w:rPr>
+      </w:pPr>
+      <w:r>
+        <w:rPr>
+          <w:b/>
+          <w:bCs/>
+        </w:rPr>
+        <w:t>on-street-parking-bays                                  23,864 bays</w:t>
+      </w:r>
+    </w:p>
+    <w:p>
+      <w:pPr>
+        <w:rPr>
+          <w:b/>
+          <w:bCs/>
+        </w:rPr>
+      </w:pPr>
+      <w:r>
+        <w:rPr>
+          <w:b/>
+          <w:bCs/>
+        </w:rPr>
+        <w:t>on-street-parking-bay-sensors                            3,309 live sensors</w:t>
+      </w:r>
+    </w:p>
+    <w:p>
+      <w:pPr>
+        <w:rPr>
+          <w:b/>
+          <w:bCs/>
+        </w:rPr>
+      </w:pPr>
+      <w:r>
+        <w:rPr>
+          <w:b/>
+          <w:bCs/>
+        </w:rPr>
+        <w:t>development-activity-monitor                             1,465 permits</w:t>
+      </w:r>
+    </w:p>
+    <w:p>
+      <w:pPr>
+        <w:rPr>
+          <w:b/>
+          <w:bCs/>
+        </w:rPr>
+      </w:pPr>
+      <w:r>
+        <w:rPr>
+          <w:b/>
+          <w:bCs/>
+        </w:rPr>
+        <w:t>pedestrian-counting-system-sensor-locations                137 sensors</w:t>
+      </w:r>
+    </w:p>
+    <w:p>
+      <w:pPr>
+        <w:rPr>
+          <w:b/>
+          <w:bCs/>
+        </w:rPr>
+      </w:pPr>
+      <w:r>
+        <w:rPr>
+          <w:b/>
+          <w:bCs/>
+        </w:rPr>
+        <w:t xml:space="preserve">microclimate-sensor-readings (live, all </w:t>
+      </w:r>
+      <w:proofErr w:type="gramStart"/>
+      <w:r>
+        <w:rPr>
+          <w:b/>
+          <w:bCs/>
+        </w:rPr>
+        <w:t xml:space="preserve">sensors)   </w:t>
+      </w:r>
+      <w:proofErr w:type="gramEnd"/>
+      <w:r>
+        <w:rPr>
+          <w:b/>
+          <w:bCs/>
+        </w:rPr>
+        <w:t xml:space="preserve">         56 current readings</w:t>
+      </w:r>
+    </w:p>
+    <w:p>
+      <w:pPr>
+        <w:rPr>
+          <w:b/>
+          <w:bCs/>
+        </w:rPr>
+      </w:pPr>
+    </w:p>
+    <w:p>
+      <w:pPr>
+        <w:rPr>
+          <w:b/>
+          <w:bCs/>
+        </w:rPr>
+      </w:pPr>
+      <w:r>
+        <w:rPr>
+          <w:b/>
+          <w:bCs/>
+        </w:rPr>
+        <w:t>CONFIRMED NEAREST SENSORS PER DEMO ADDRESS</w:t>
+      </w:r>
+    </w:p>
+    <w:p>
+      <w:pPr>
+        <w:rPr>
+          <w:b/>
+          <w:bCs/>
+        </w:rPr>
+      </w:pPr>
+      <w:r>
+        <w:rPr>
+          <w:b/>
+          <w:bCs/>
+        </w:rPr>
+        <w:t>-------------------------------------------</w:t>
+      </w:r>
+    </w:p>
+    <w:p>
+      <w:pPr>
+        <w:rPr>
+          <w:b/>
+          <w:bCs/>
+        </w:rPr>
+      </w:pPr>
+      <w:r>
+        <w:rPr>
+          <w:b/>
+          <w:bCs/>
+        </w:rPr>
+        <w:t xml:space="preserve">Bourke St Mall    -&gt; </w:t>
+      </w:r>
+      <w:proofErr w:type="spellStart"/>
+      <w:r>
+        <w:rPr>
+          <w:b/>
+          <w:bCs/>
+        </w:rPr>
+        <w:t>sensor_id</w:t>
+      </w:r>
+      <w:proofErr w:type="spellEnd"/>
+      <w:r>
+        <w:rPr>
+          <w:b/>
+          <w:bCs/>
+        </w:rPr>
+        <w:t xml:space="preserve"> 2</w:t>
+      </w:r>
+    </w:p>
+    <w:p>
+      <w:pPr>
+        <w:rPr>
+          <w:b/>
+          <w:bCs/>
+        </w:rPr>
+      </w:pPr>
+      <w:r>
+        <w:rPr>
+          <w:b/>
+          <w:bCs/>
+        </w:rPr>
+        <w:t xml:space="preserve">Lygon/Faraday     -&gt; </w:t>
+      </w:r>
+      <w:proofErr w:type="spellStart"/>
+      <w:r>
+        <w:rPr>
+          <w:b/>
+          <w:bCs/>
+        </w:rPr>
+        <w:t>sensor_id</w:t>
+      </w:r>
+      <w:proofErr w:type="spellEnd"/>
+      <w:r>
+        <w:rPr>
+          <w:b/>
+          <w:bCs/>
+        </w:rPr>
+        <w:t xml:space="preserve"> 50</w:t>
+      </w:r>
+    </w:p>
+    <w:p>
+      <w:pPr>
+        <w:rPr>
+          <w:b/>
+          <w:bCs/>
+        </w:rPr>
+      </w:pPr>
+      <w:r>
+        <w:rPr>
+          <w:b/>
+          <w:bCs/>
+        </w:rPr>
+        <w:t xml:space="preserve">Southbank         -&gt; </w:t>
+      </w:r>
+      <w:proofErr w:type="spellStart"/>
+      <w:r>
+        <w:rPr>
+          <w:b/>
+          <w:bCs/>
+        </w:rPr>
+        <w:t>sensor_id</w:t>
+      </w:r>
+      <w:proofErr w:type="spellEnd"/>
+      <w:r>
+        <w:rPr>
+          <w:b/>
+          <w:bCs/>
+        </w:rPr>
+        <w:t xml:space="preserve"> 212</w:t>
+      </w:r>
+    </w:p>
+    <w:p>
+      <w:pPr>
+        <w:rPr>
+          <w:b/>
+          <w:bCs/>
+        </w:rPr>
+      </w:pPr>
+    </w:p>
+    <w:p>
+      <w:pPr>
+        <w:rPr>
+          <w:b/>
+          <w:bCs/>
+        </w:rPr>
+      </w:pPr>
+      <w:r>
+        <w:rPr>
+          <w:b/>
+          <w:bCs/>
+        </w:rPr>
+        <w:t>NOTE: road-segment (static geometry) is cached in place of road-disruptions.</w:t>
+      </w:r>
+    </w:p>
+    <w:p>
+      <w:pPr>
+        <w:rPr>
+          <w:b/>
+          <w:bCs/>
+        </w:rPr>
+      </w:pPr>
+      <w:r>
+        <w:rPr>
+          <w:b/>
+          <w:bCs/>
+        </w:rPr>
+        <w:t xml:space="preserve">The live DTP disruptions API does not appear to have a slug on the </w:t>
+      </w:r>
+      <w:proofErr w:type="spellStart"/>
+      <w:r>
+        <w:rPr>
+          <w:b/>
+          <w:bCs/>
+        </w:rPr>
+        <w:t>CoM</w:t>
+      </w:r>
+      <w:proofErr w:type="spellEnd"/>
+      <w:r>
+        <w:rPr>
+          <w:b/>
+          <w:bCs/>
+        </w:rPr>
+        <w:t xml:space="preserve"> portal.</w:t>
+      </w:r>
+    </w:p>
+    <w:p>
+      <w:pPr>
+        <w:rPr>
+          <w:b/>
+          <w:bCs/>
+        </w:rPr>
+      </w:pPr>
+      <w:r>
+        <w:rPr>
+          <w:b/>
+          <w:bCs/>
+        </w:rPr>
+        <w:t>Check /</w:t>
+      </w:r>
+      <w:proofErr w:type="spellStart"/>
+      <w:r>
+        <w:rPr>
+          <w:b/>
+          <w:bCs/>
+        </w:rPr>
+        <w:t>api</w:t>
+      </w:r>
+      <w:proofErr w:type="spellEnd"/>
+      <w:r>
+        <w:rPr>
+          <w:b/>
+          <w:bCs/>
+        </w:rPr>
+        <w:t>/explore/v2.1/</w:t>
+      </w:r>
+      <w:proofErr w:type="spellStart"/>
+      <w:r>
+        <w:rPr>
+          <w:b/>
+          <w:bCs/>
+        </w:rPr>
+        <w:t>catalog</w:t>
+      </w:r>
+      <w:proofErr w:type="spellEnd"/>
+      <w:r>
+        <w:rPr>
+          <w:b/>
+          <w:bCs/>
+        </w:rPr>
+        <w:t>/</w:t>
+      </w:r>
+      <w:proofErr w:type="spellStart"/>
+      <w:r>
+        <w:rPr>
+          <w:b/>
+          <w:bCs/>
+        </w:rPr>
+        <w:t>datasets?q</w:t>
+      </w:r>
+      <w:proofErr w:type="spellEnd"/>
+      <w:r>
+        <w:rPr>
+          <w:b/>
+          <w:bCs/>
+        </w:rPr>
+        <w:t>=disruption on the day.</w:t>
+      </w:r>
+    </w:p>
+    <w:p>
+      <w:pPr>
+        <w:rPr>
+          <w:b/>
+          <w:bCs/>
+        </w:rPr>
+      </w:pPr>
+    </w:p>
+    <w:p>
+      <w:pPr>
+        <w:rPr>
+          <w:b/>
+          <w:bCs/>
+        </w:rPr>
+      </w:pPr>
+      <w:r>
+        <w:rPr>
+          <w:b/>
+          <w:bCs/>
+        </w:rPr>
+        <w:t>OUTPUT</w:t>
+      </w:r>
+    </w:p>
+    <w:p>
+      <w:pPr>
+        <w:rPr>
+          <w:b/>
+          <w:bCs/>
+        </w:rPr>
+      </w:pPr>
+      <w:r>
+        <w:rPr>
+          <w:b/>
+          <w:bCs/>
+        </w:rPr>
+        <w:t>------</w:t>
+      </w:r>
+    </w:p>
+    <w:p>
+      <w:pPr>
+        <w:rPr>
+          <w:b/>
+          <w:bCs/>
+        </w:rPr>
+      </w:pPr>
+      <w:r>
+        <w:rPr>
+          <w:b/>
+          <w:bCs/>
+        </w:rPr>
+        <w:t xml:space="preserve">    cache/</w:t>
+      </w:r>
+    </w:p>
+    <w:p>
+      <w:pPr>
+        <w:rPr>
+          <w:b/>
+          <w:bCs/>
+        </w:rPr>
+      </w:pPr>
+      <w:r>
+        <w:rPr>
+          <w:b/>
+          <w:bCs/>
+        </w:rPr>
+        <w:t xml:space="preserve">      </w:t>
+      </w:r>
+      <w:proofErr w:type="spellStart"/>
+      <w:proofErr w:type="gramStart"/>
+      <w:r>
+        <w:rPr>
+          <w:b/>
+          <w:bCs/>
+        </w:rPr>
+        <w:t>catalog.json</w:t>
+      </w:r>
+      <w:proofErr w:type="spellEnd"/>
+      <w:proofErr w:type="gramEnd"/>
+      <w:r>
+        <w:rPr>
+          <w:b/>
+          <w:bCs/>
+        </w:rPr>
+        <w:t xml:space="preserve">                      full dataset list (id -&gt; title)</w:t>
+      </w:r>
+    </w:p>
+    <w:p>
+      <w:pPr>
+        <w:rPr>
+          <w:b/>
+          <w:bCs/>
+        </w:rPr>
+      </w:pPr>
+      <w:r>
+        <w:rPr>
+          <w:b/>
+          <w:bCs/>
+        </w:rPr>
+        <w:t xml:space="preserve">      datasets/&lt;id</w:t>
+      </w:r>
+      <w:proofErr w:type="gramStart"/>
+      <w:r>
+        <w:rPr>
+          <w:b/>
+          <w:bCs/>
+        </w:rPr>
+        <w:t>&gt;.</w:t>
+      </w:r>
+      <w:proofErr w:type="spellStart"/>
+      <w:r>
+        <w:rPr>
+          <w:b/>
+          <w:bCs/>
+        </w:rPr>
+        <w:t>json</w:t>
+      </w:r>
+      <w:proofErr w:type="spellEnd"/>
+      <w:proofErr w:type="gramEnd"/>
+      <w:r>
+        <w:rPr>
+          <w:b/>
+          <w:bCs/>
+        </w:rPr>
+        <w:t xml:space="preserve">                100-record sample + </w:t>
+      </w:r>
+      <w:proofErr w:type="spellStart"/>
+      <w:r>
+        <w:rPr>
+          <w:b/>
+          <w:bCs/>
+        </w:rPr>
+        <w:t>total_count</w:t>
+      </w:r>
+      <w:proofErr w:type="spellEnd"/>
+    </w:p>
+    <w:p>
+      <w:pPr>
+        <w:rPr>
+          <w:b/>
+          <w:bCs/>
+        </w:rPr>
+      </w:pPr>
+      <w:r>
+        <w:rPr>
+          <w:b/>
+          <w:bCs/>
+        </w:rPr>
+        <w:t xml:space="preserve">      live/&lt;id</w:t>
+      </w:r>
+      <w:proofErr w:type="gramStart"/>
+      <w:r>
+        <w:rPr>
+          <w:b/>
+          <w:bCs/>
+        </w:rPr>
+        <w:t>&gt;.&lt;ISO&gt;.</w:t>
+      </w:r>
+      <w:proofErr w:type="spellStart"/>
+      <w:r>
+        <w:rPr>
+          <w:b/>
+          <w:bCs/>
+        </w:rPr>
+        <w:t>json</w:t>
+      </w:r>
+      <w:proofErr w:type="spellEnd"/>
+      <w:proofErr w:type="gramEnd"/>
+      <w:r>
+        <w:rPr>
+          <w:b/>
+          <w:bCs/>
+        </w:rPr>
+        <w:t xml:space="preserve">              timestamped live snapshots</w:t>
+      </w:r>
+    </w:p>
+    <w:p>
+      <w:pPr>
+        <w:rPr>
+          <w:b/>
+          <w:bCs/>
+        </w:rPr>
+      </w:pPr>
+      <w:r>
+        <w:rPr>
+          <w:b/>
+          <w:bCs/>
+        </w:rPr>
+        <w:t xml:space="preserve">      addresses/&lt;slug</w:t>
+      </w:r>
+      <w:proofErr w:type="gramStart"/>
+      <w:r>
+        <w:rPr>
+          <w:b/>
+          <w:bCs/>
+        </w:rPr>
+        <w:t>&gt;.</w:t>
+      </w:r>
+      <w:proofErr w:type="spellStart"/>
+      <w:r>
+        <w:rPr>
+          <w:b/>
+          <w:bCs/>
+        </w:rPr>
+        <w:t>json</w:t>
+      </w:r>
+      <w:proofErr w:type="spellEnd"/>
+      <w:proofErr w:type="gramEnd"/>
+      <w:r>
+        <w:rPr>
+          <w:b/>
+          <w:bCs/>
+        </w:rPr>
+        <w:t xml:space="preserve">             per-address proximity bundle + counts</w:t>
+      </w:r>
+    </w:p>
+    <w:p>
+      <w:pPr>
+        <w:rPr>
+          <w:b/>
+          <w:bCs/>
+        </w:rPr>
+      </w:pPr>
+      <w:r>
+        <w:rPr>
+          <w:b/>
+          <w:bCs/>
+        </w:rPr>
+        <w:t xml:space="preserve">      </w:t>
+      </w:r>
+      <w:proofErr w:type="spellStart"/>
+      <w:proofErr w:type="gramStart"/>
+      <w:r>
+        <w:rPr>
+          <w:b/>
+          <w:bCs/>
+        </w:rPr>
+        <w:t>manifest.json</w:t>
+      </w:r>
+      <w:proofErr w:type="spellEnd"/>
+      <w:proofErr w:type="gramEnd"/>
+      <w:r>
+        <w:rPr>
+          <w:b/>
+          <w:bCs/>
+        </w:rPr>
+        <w:t xml:space="preserve">                     summary of the whole run</w:t>
+      </w:r>
+    </w:p>
+    <w:p>
+      <w:pPr>
+        <w:rPr>
+          <w:b/>
+          <w:bCs/>
+        </w:rPr>
+      </w:pPr>
+      <w:r>
+        <w:rPr>
+          <w:b/>
+          <w:bCs/>
+        </w:rPr>
+        <w:t>"""</w:t>
+      </w:r>
+    </w:p>
+    <w:p>
+      <w:pPr>
+        <w:rPr>
+          <w:b/>
+          <w:bCs/>
+        </w:rPr>
+      </w:pPr>
+    </w:p>
+    <w:p>
+      <w:pPr>
+        <w:rPr>
+          <w:b/>
+          <w:bCs/>
+        </w:rPr>
+      </w:pPr>
+      <w:r>
+        <w:rPr>
+          <w:b/>
+          <w:bCs/>
+        </w:rPr>
+        <w:t xml:space="preserve">import </w:t>
+      </w:r>
+      <w:proofErr w:type="spellStart"/>
+      <w:r>
+        <w:rPr>
+          <w:b/>
+          <w:bCs/>
+        </w:rPr>
+        <w:t>json</w:t>
+      </w:r>
+      <w:proofErr w:type="spellEnd"/>
+      <w:r>
+        <w:rPr>
+          <w:b/>
+          <w:bCs/>
+        </w:rPr>
+        <w:t xml:space="preserve">, </w:t>
+      </w:r>
+      <w:proofErr w:type="spellStart"/>
+      <w:r>
+        <w:rPr>
+          <w:b/>
+          <w:bCs/>
+        </w:rPr>
+        <w:t>os</w:t>
+      </w:r>
+      <w:proofErr w:type="spellEnd"/>
+      <w:r>
+        <w:rPr>
+          <w:b/>
+          <w:bCs/>
+        </w:rPr>
+        <w:t xml:space="preserve">, sys, time, math, </w:t>
+      </w:r>
+      <w:proofErr w:type="spellStart"/>
+      <w:proofErr w:type="gramStart"/>
+      <w:r>
+        <w:rPr>
+          <w:b/>
+          <w:bCs/>
+        </w:rPr>
+        <w:t>urllib.parse</w:t>
+      </w:r>
+      <w:proofErr w:type="spellEnd"/>
+      <w:proofErr w:type="gramEnd"/>
+      <w:r>
+        <w:rPr>
+          <w:b/>
+          <w:bCs/>
+        </w:rPr>
+        <w:t xml:space="preserve">, </w:t>
+      </w:r>
+      <w:proofErr w:type="spellStart"/>
+      <w:proofErr w:type="gramStart"/>
+      <w:r>
+        <w:rPr>
+          <w:b/>
+          <w:bCs/>
+        </w:rPr>
+        <w:t>urllib.request</w:t>
+      </w:r>
+      <w:proofErr w:type="spellEnd"/>
+      <w:proofErr w:type="gramEnd"/>
+      <w:r>
+        <w:rPr>
+          <w:b/>
+          <w:bCs/>
+        </w:rPr>
+        <w:t xml:space="preserve">, </w:t>
+      </w:r>
+      <w:proofErr w:type="spellStart"/>
+      <w:proofErr w:type="gramStart"/>
+      <w:r>
+        <w:rPr>
+          <w:b/>
+          <w:bCs/>
+        </w:rPr>
+        <w:t>urllib.error</w:t>
+      </w:r>
+      <w:proofErr w:type="spellEnd"/>
+      <w:proofErr w:type="gramEnd"/>
+    </w:p>
+    <w:p>
+      <w:pPr>
+        <w:rPr>
+          <w:b/>
+          <w:bCs/>
+        </w:rPr>
+      </w:pPr>
+      <w:r>
+        <w:rPr>
+          <w:b/>
+          <w:bCs/>
+        </w:rPr>
+        <w:t xml:space="preserve">from datetime import datetime, </w:t>
+      </w:r>
+      <w:proofErr w:type="spellStart"/>
+      <w:r>
+        <w:rPr>
+          <w:b/>
+          <w:bCs/>
+        </w:rPr>
+        <w:t>timezone</w:t>
+      </w:r>
+      <w:proofErr w:type="spellEnd"/>
+    </w:p>
+    <w:p>
+      <w:pPr>
+        <w:rPr>
+          <w:b/>
+          <w:bCs/>
+        </w:rPr>
+      </w:pPr>
+    </w:p>
+    <w:p>
+      <w:pPr>
+        <w:rPr>
+          <w:b/>
+          <w:bCs/>
+        </w:rPr>
+      </w:pPr>
+      <w:r>
+        <w:rPr>
+          <w:b/>
+          <w:bCs/>
+        </w:rPr>
+        <w:t>BASE = "https://data.melbourne.vic.gov.au/</w:t>
+      </w:r>
+      <w:proofErr w:type="spellStart"/>
+      <w:r>
+        <w:rPr>
+          <w:b/>
+          <w:bCs/>
+        </w:rPr>
+        <w:t>api</w:t>
+      </w:r>
+      <w:proofErr w:type="spellEnd"/>
+      <w:r>
+        <w:rPr>
+          <w:b/>
+          <w:bCs/>
+        </w:rPr>
+        <w:t>/explore/v2.1"</w:t>
+      </w:r>
+    </w:p>
+    <w:p>
+      <w:pPr>
+        <w:rPr>
+          <w:b/>
+          <w:bCs/>
+        </w:rPr>
+      </w:pPr>
+      <w:r>
+        <w:rPr>
+          <w:b/>
+          <w:bCs/>
+        </w:rPr>
+        <w:t xml:space="preserve">APIKEY = </w:t>
+      </w:r>
+      <w:proofErr w:type="spellStart"/>
+      <w:proofErr w:type="gramStart"/>
+      <w:r>
+        <w:rPr>
+          <w:b/>
+          <w:bCs/>
+        </w:rPr>
+        <w:t>os.environ.get</w:t>
+      </w:r>
+      <w:proofErr w:type="spellEnd"/>
+      <w:r>
+        <w:rPr>
+          <w:b/>
+          <w:bCs/>
+        </w:rPr>
+        <w:t>(</w:t>
+      </w:r>
+      <w:proofErr w:type="gramEnd"/>
+      <w:r>
+        <w:rPr>
+          <w:b/>
+          <w:bCs/>
+        </w:rPr>
+        <w:t>"COM_APIKEY", ""</w:t>
+      </w:r>
+      <w:proofErr w:type="gramStart"/>
+      <w:r>
+        <w:rPr>
+          <w:b/>
+          <w:bCs/>
+        </w:rPr>
+        <w:t>).strip</w:t>
+      </w:r>
+      <w:proofErr w:type="gramEnd"/>
+      <w:r>
+        <w:rPr>
+          <w:b/>
+          <w:bCs/>
+        </w:rPr>
+        <w:t>()</w:t>
+      </w:r>
+    </w:p>
+    <w:p>
+      <w:pPr>
+        <w:rPr>
+          <w:b/>
+          <w:bCs/>
+        </w:rPr>
+      </w:pPr>
+      <w:r>
+        <w:rPr>
+          <w:b/>
+          <w:bCs/>
+        </w:rPr>
+        <w:t xml:space="preserve">OUT = </w:t>
+      </w:r>
+      <w:proofErr w:type="spellStart"/>
+      <w:proofErr w:type="gramStart"/>
+      <w:r>
+        <w:rPr>
+          <w:b/>
+          <w:bCs/>
+        </w:rPr>
+        <w:t>os.path</w:t>
+      </w:r>
+      <w:proofErr w:type="gramEnd"/>
+      <w:r>
+        <w:rPr>
+          <w:b/>
+          <w:bCs/>
+        </w:rPr>
+        <w:t>.join</w:t>
+      </w:r>
+      <w:proofErr w:type="spellEnd"/>
+      <w:r>
+        <w:rPr>
+          <w:b/>
+          <w:bCs/>
+        </w:rPr>
+        <w:t>(</w:t>
+      </w:r>
+      <w:proofErr w:type="spellStart"/>
+      <w:proofErr w:type="gramStart"/>
+      <w:r>
+        <w:rPr>
+          <w:b/>
+          <w:bCs/>
+        </w:rPr>
+        <w:t>os.path</w:t>
+      </w:r>
+      <w:proofErr w:type="gramEnd"/>
+      <w:r>
+        <w:rPr>
+          <w:b/>
+          <w:bCs/>
+        </w:rPr>
+        <w:t>.dirname</w:t>
+      </w:r>
+      <w:proofErr w:type="spellEnd"/>
+      <w:r>
+        <w:rPr>
+          <w:b/>
+          <w:bCs/>
+        </w:rPr>
+        <w:t>(</w:t>
+      </w:r>
+      <w:proofErr w:type="spellStart"/>
+      <w:proofErr w:type="gramStart"/>
+      <w:r>
+        <w:rPr>
+          <w:b/>
+          <w:bCs/>
+        </w:rPr>
+        <w:t>os.path</w:t>
+      </w:r>
+      <w:proofErr w:type="gramEnd"/>
+      <w:r>
+        <w:rPr>
+          <w:b/>
+          <w:bCs/>
+        </w:rPr>
+        <w:t>.abspath</w:t>
+      </w:r>
+      <w:proofErr w:type="spellEnd"/>
+      <w:r>
+        <w:rPr>
+          <w:b/>
+          <w:bCs/>
+        </w:rPr>
+        <w:t>(__file__)), "cache")</w:t>
+      </w:r>
+    </w:p>
+    <w:p>
+      <w:pPr>
+        <w:rPr>
+          <w:b/>
+          <w:bCs/>
+        </w:rPr>
+      </w:pPr>
+      <w:r>
+        <w:rPr>
+          <w:b/>
+          <w:bCs/>
+        </w:rPr>
+        <w:t>SAMPLE = 100          # records per dataset sample (API max per call is 100)</w:t>
+      </w:r>
+    </w:p>
+    <w:p>
+      <w:pPr>
+        <w:rPr>
+          <w:b/>
+          <w:bCs/>
+        </w:rPr>
+      </w:pPr>
+      <w:r>
+        <w:rPr>
+          <w:b/>
+          <w:bCs/>
+        </w:rPr>
+        <w:t>PROX_RADIUS_M = 400   # walking-distance radius for demo-address tests</w:t>
+      </w:r>
+    </w:p>
+    <w:p>
+      <w:pPr>
+        <w:rPr>
+          <w:b/>
+          <w:bCs/>
+        </w:rPr>
+      </w:pPr>
+      <w:r>
+        <w:rPr>
+          <w:b/>
+          <w:bCs/>
+        </w:rPr>
+        <w:t>PROX_CAP = 300        # max records to pull per dataset per address</w:t>
+      </w:r>
+    </w:p>
+    <w:p>
+      <w:pPr>
+        <w:rPr>
+          <w:b/>
+          <w:bCs/>
+        </w:rPr>
+      </w:pPr>
+      <w:r>
+        <w:rPr>
+          <w:b/>
+          <w:bCs/>
+        </w:rPr>
+        <w:t>PAUSE = 0.3           # politeness delay between calls (seconds)</w:t>
+      </w:r>
+    </w:p>
+    <w:p>
+      <w:pPr>
+        <w:rPr>
+          <w:b/>
+          <w:bCs/>
+        </w:rPr>
+      </w:pPr>
+    </w:p>
+    <w:p>
+      <w:pPr>
+        <w:rPr>
+          <w:b/>
+          <w:bCs/>
+        </w:rPr>
+      </w:pPr>
+      <w:r>
+        <w:rPr>
+          <w:b/>
+          <w:bCs/>
+        </w:rPr>
+        <w:t># ---------------------------------------------------------------------------</w:t>
+      </w:r>
+    </w:p>
+    <w:p>
+      <w:pPr>
+        <w:rPr>
+          <w:b/>
+          <w:bCs/>
+        </w:rPr>
+      </w:pPr>
+      <w:r>
+        <w:rPr>
+          <w:b/>
+          <w:bCs/>
+        </w:rPr>
+        <w:t># Three demo addresses (chosen for dense, overlapping data coverage inside the</w:t>
+      </w:r>
+    </w:p>
+    <w:p>
+      <w:pPr>
+        <w:rPr>
+          <w:b/>
+          <w:bCs/>
+        </w:rPr>
+      </w:pPr>
+      <w:r>
+        <w:rPr>
+          <w:b/>
+          <w:bCs/>
+        </w:rPr>
+        <w:t xml:space="preserve"># City of Melbourne LGA). Coordinates are </w:t>
+      </w:r>
+      <w:proofErr w:type="spellStart"/>
+      <w:r>
+        <w:rPr>
+          <w:b/>
+          <w:bCs/>
+        </w:rPr>
+        <w:t>lon</w:t>
+      </w:r>
+      <w:proofErr w:type="spellEnd"/>
+      <w:r>
+        <w:rPr>
+          <w:b/>
+          <w:bCs/>
+        </w:rPr>
+        <w:t>/</w:t>
+      </w:r>
+      <w:proofErr w:type="spellStart"/>
+      <w:r>
+        <w:rPr>
+          <w:b/>
+          <w:bCs/>
+        </w:rPr>
+        <w:t>lat</w:t>
+      </w:r>
+      <w:proofErr w:type="spellEnd"/>
+      <w:r>
+        <w:rPr>
+          <w:b/>
+          <w:bCs/>
+        </w:rPr>
+        <w:t xml:space="preserve">-ready (we store </w:t>
+      </w:r>
+      <w:proofErr w:type="spellStart"/>
+      <w:r>
+        <w:rPr>
+          <w:b/>
+          <w:bCs/>
+        </w:rPr>
+        <w:t>lat</w:t>
+      </w:r>
+      <w:proofErr w:type="spellEnd"/>
+      <w:r>
+        <w:rPr>
+          <w:b/>
+          <w:bCs/>
+        </w:rPr>
+        <w:t xml:space="preserve"> &amp; </w:t>
+      </w:r>
+      <w:proofErr w:type="spellStart"/>
+      <w:r>
+        <w:rPr>
+          <w:b/>
+          <w:bCs/>
+        </w:rPr>
+        <w:t>lon</w:t>
+      </w:r>
+      <w:proofErr w:type="spellEnd"/>
+      <w:r>
+        <w:rPr>
+          <w:b/>
+          <w:bCs/>
+        </w:rPr>
+        <w:t>).</w:t>
+      </w:r>
+    </w:p>
+    <w:p>
+      <w:pPr>
+        <w:rPr>
+          <w:b/>
+          <w:bCs/>
+        </w:rPr>
+      </w:pPr>
+      <w:r>
+        <w:rPr>
+          <w:b/>
+          <w:bCs/>
+        </w:rPr>
+        <w:t># ---------------------------------------------------------------------------</w:t>
+      </w:r>
+    </w:p>
+    <w:p>
+      <w:pPr>
+        <w:rPr>
+          <w:b/>
+          <w:bCs/>
+        </w:rPr>
+      </w:pPr>
+      <w:r>
+        <w:rPr>
+          <w:b/>
+          <w:bCs/>
+        </w:rPr>
+        <w:t>DEMO_ADDRESSES = [</w:t>
+      </w:r>
+    </w:p>
+    <w:p>
+      <w:pPr>
+        <w:rPr>
+          <w:b/>
+          <w:bCs/>
+        </w:rPr>
+      </w:pPr>
+      <w:r>
+        <w:rPr>
+          <w:b/>
+          <w:bCs/>
+        </w:rPr>
+        <w:t xml:space="preserve">    {"slug": "</w:t>
+      </w:r>
+      <w:proofErr w:type="spellStart"/>
+      <w:r>
+        <w:rPr>
+          <w:b/>
+          <w:bCs/>
+        </w:rPr>
+        <w:t>bourke</w:t>
+      </w:r>
+      <w:proofErr w:type="spellEnd"/>
+      <w:r>
+        <w:rPr>
+          <w:b/>
+          <w:bCs/>
+        </w:rPr>
+        <w:t>-st-mall</w:t>
+      </w:r>
+      <w:proofErr w:type="gramStart"/>
+      <w:r>
+        <w:rPr>
+          <w:b/>
+          <w:bCs/>
+        </w:rPr>
+        <w:t>",  "</w:t>
+      </w:r>
+      <w:proofErr w:type="gramEnd"/>
+      <w:r>
+        <w:rPr>
+          <w:b/>
+          <w:bCs/>
+        </w:rPr>
+        <w:t>label": "Bourke Street Mall, Melbourne CBD",</w:t>
+      </w:r>
+    </w:p>
+    <w:p>
+      <w:pPr>
+        <w:rPr>
+          <w:b/>
+          <w:bCs/>
+        </w:rPr>
+      </w:pPr>
+      <w:r>
+        <w:rPr>
+          <w:b/>
+          <w:bCs/>
+        </w:rPr>
+        <w:t xml:space="preserve">     "</w:t>
+      </w:r>
+      <w:proofErr w:type="spellStart"/>
+      <w:r>
+        <w:rPr>
+          <w:b/>
+          <w:bCs/>
+        </w:rPr>
+        <w:t>lat</w:t>
+      </w:r>
+      <w:proofErr w:type="spellEnd"/>
+      <w:r>
+        <w:rPr>
+          <w:b/>
+          <w:bCs/>
+        </w:rPr>
+        <w:t>": -37.8137, "</w:t>
+      </w:r>
+      <w:proofErr w:type="spellStart"/>
+      <w:r>
+        <w:rPr>
+          <w:b/>
+          <w:bCs/>
+        </w:rPr>
+        <w:t>lon</w:t>
+      </w:r>
+      <w:proofErr w:type="spellEnd"/>
+      <w:r>
+        <w:rPr>
+          <w:b/>
+          <w:bCs/>
+        </w:rPr>
+        <w:t>": 144.9646,</w:t>
+      </w:r>
+    </w:p>
+    <w:p>
+      <w:pPr>
+        <w:rPr>
+          <w:b/>
+          <w:bCs/>
+        </w:rPr>
+      </w:pPr>
+      <w:r>
+        <w:rPr>
+          <w:b/>
+          <w:bCs/>
+        </w:rPr>
+        <w:t xml:space="preserve">     "</w:t>
+      </w:r>
+      <w:proofErr w:type="spellStart"/>
+      <w:proofErr w:type="gramStart"/>
+      <w:r>
+        <w:rPr>
+          <w:b/>
+          <w:bCs/>
+        </w:rPr>
+        <w:t>nearest</w:t>
+      </w:r>
+      <w:proofErr w:type="gramEnd"/>
+      <w:r>
+        <w:rPr>
+          <w:b/>
+          <w:bCs/>
+        </w:rPr>
+        <w:t>_sensor_id</w:t>
+      </w:r>
+      <w:proofErr w:type="spellEnd"/>
+      <w:r>
+        <w:rPr>
+          <w:b/>
+          <w:bCs/>
+        </w:rPr>
+        <w:t xml:space="preserve">": </w:t>
+      </w:r>
+      <w:proofErr w:type="gramStart"/>
+      <w:r>
+        <w:rPr>
+          <w:b/>
+          <w:bCs/>
+        </w:rPr>
+        <w:t xml:space="preserve">2,   </w:t>
+      </w:r>
+      <w:proofErr w:type="gramEnd"/>
+      <w:r>
+        <w:rPr>
+          <w:b/>
+          <w:bCs/>
+        </w:rPr>
+        <w:t># confirmed from prefetch run</w:t>
+      </w:r>
+    </w:p>
+    <w:p>
+      <w:pPr>
+        <w:rPr>
+          <w:b/>
+          <w:bCs/>
+        </w:rPr>
+      </w:pPr>
+      <w:r>
+        <w:rPr>
+          <w:b/>
+          <w:bCs/>
+        </w:rPr>
+        <w:t xml:space="preserve">     "why": "Heart of CBD retail; multiple pedestrian sensors, dense CLUE blocks, street trees."},</w:t>
+      </w:r>
+    </w:p>
+    <w:p>
+      <w:pPr>
+        <w:rPr>
+          <w:b/>
+          <w:bCs/>
+        </w:rPr>
+      </w:pPr>
+      <w:r>
+        <w:rPr>
+          <w:b/>
+          <w:bCs/>
+        </w:rPr>
+        <w:t xml:space="preserve">    {"slug": "</w:t>
+      </w:r>
+      <w:proofErr w:type="spellStart"/>
+      <w:r>
+        <w:rPr>
+          <w:b/>
+          <w:bCs/>
+        </w:rPr>
+        <w:t>lygon-carlton</w:t>
+      </w:r>
+      <w:proofErr w:type="spellEnd"/>
+      <w:proofErr w:type="gramStart"/>
+      <w:r>
+        <w:rPr>
+          <w:b/>
+          <w:bCs/>
+        </w:rPr>
+        <w:t xml:space="preserve">",   </w:t>
+      </w:r>
+      <w:proofErr w:type="gramEnd"/>
+      <w:r>
+        <w:rPr>
+          <w:b/>
+          <w:bCs/>
+        </w:rPr>
+        <w:t>"label": "Lygon St &amp; Faraday St, Carlton",</w:t>
+      </w:r>
+    </w:p>
+    <w:p>
+      <w:pPr>
+        <w:rPr>
+          <w:b/>
+          <w:bCs/>
+        </w:rPr>
+      </w:pPr>
+      <w:r>
+        <w:rPr>
+          <w:b/>
+          <w:bCs/>
+        </w:rPr>
+        <w:t xml:space="preserve">     "</w:t>
+      </w:r>
+      <w:proofErr w:type="spellStart"/>
+      <w:r>
+        <w:rPr>
+          <w:b/>
+          <w:bCs/>
+        </w:rPr>
+        <w:t>lat</w:t>
+      </w:r>
+      <w:proofErr w:type="spellEnd"/>
+      <w:r>
+        <w:rPr>
+          <w:b/>
+          <w:bCs/>
+        </w:rPr>
+        <w:t>": -37.7986, "</w:t>
+      </w:r>
+      <w:proofErr w:type="spellStart"/>
+      <w:r>
+        <w:rPr>
+          <w:b/>
+          <w:bCs/>
+        </w:rPr>
+        <w:t>lon</w:t>
+      </w:r>
+      <w:proofErr w:type="spellEnd"/>
+      <w:r>
+        <w:rPr>
+          <w:b/>
+          <w:bCs/>
+        </w:rPr>
+        <w:t>": 144.9669,</w:t>
+      </w:r>
+    </w:p>
+    <w:p>
+      <w:pPr>
+        <w:rPr>
+          <w:b/>
+          <w:bCs/>
+        </w:rPr>
+      </w:pPr>
+      <w:r>
+        <w:rPr>
+          <w:b/>
+          <w:bCs/>
+        </w:rPr>
+        <w:t xml:space="preserve">     "</w:t>
+      </w:r>
+      <w:proofErr w:type="spellStart"/>
+      <w:proofErr w:type="gramStart"/>
+      <w:r>
+        <w:rPr>
+          <w:b/>
+          <w:bCs/>
+        </w:rPr>
+        <w:t>nearest</w:t>
+      </w:r>
+      <w:proofErr w:type="gramEnd"/>
+      <w:r>
+        <w:rPr>
+          <w:b/>
+          <w:bCs/>
+        </w:rPr>
+        <w:t>_sensor_id</w:t>
+      </w:r>
+      <w:proofErr w:type="spellEnd"/>
+      <w:r>
+        <w:rPr>
+          <w:b/>
+          <w:bCs/>
+        </w:rPr>
+        <w:t xml:space="preserve">": </w:t>
+      </w:r>
+      <w:proofErr w:type="gramStart"/>
+      <w:r>
+        <w:rPr>
+          <w:b/>
+          <w:bCs/>
+        </w:rPr>
+        <w:t>50,  #</w:t>
+      </w:r>
+      <w:proofErr w:type="gramEnd"/>
+      <w:r>
+        <w:rPr>
+          <w:b/>
+          <w:bCs/>
+        </w:rPr>
+        <w:t xml:space="preserve"> confirmed from prefetch run</w:t>
+      </w:r>
+    </w:p>
+    <w:p>
+      <w:pPr>
+        <w:rPr>
+          <w:b/>
+          <w:bCs/>
+        </w:rPr>
+      </w:pPr>
+      <w:r>
+        <w:rPr>
+          <w:b/>
+          <w:bCs/>
+        </w:rPr>
+        <w:t xml:space="preserve">     "why": "Famous hospitality strip; cafes/bars with seat counts, rich CLUE history, canopy."},</w:t>
+      </w:r>
+    </w:p>
+    <w:p>
+      <w:pPr>
+        <w:rPr>
+          <w:b/>
+          <w:bCs/>
+        </w:rPr>
+      </w:pPr>
+      <w:r>
+        <w:rPr>
+          <w:b/>
+          <w:bCs/>
+        </w:rPr>
+        <w:t xml:space="preserve">    {"slug": "</w:t>
+      </w:r>
+      <w:proofErr w:type="spellStart"/>
+      <w:r>
+        <w:rPr>
+          <w:b/>
+          <w:bCs/>
+        </w:rPr>
+        <w:t>southbank</w:t>
+      </w:r>
+      <w:proofErr w:type="spellEnd"/>
+      <w:r>
+        <w:rPr>
+          <w:b/>
+          <w:bCs/>
+        </w:rPr>
+        <w:t>-promenade", "label": "Southbank Promenade (Southgate), Southbank",</w:t>
+      </w:r>
+    </w:p>
+    <w:p>
+      <w:pPr>
+        <w:rPr>
+          <w:b/>
+          <w:bCs/>
+        </w:rPr>
+      </w:pPr>
+      <w:r>
+        <w:rPr>
+          <w:b/>
+          <w:bCs/>
+        </w:rPr>
+        <w:t xml:space="preserve">     "</w:t>
+      </w:r>
+      <w:proofErr w:type="spellStart"/>
+      <w:r>
+        <w:rPr>
+          <w:b/>
+          <w:bCs/>
+        </w:rPr>
+        <w:t>lat</w:t>
+      </w:r>
+      <w:proofErr w:type="spellEnd"/>
+      <w:r>
+        <w:rPr>
+          <w:b/>
+          <w:bCs/>
+        </w:rPr>
+        <w:t>": -37.8205, "</w:t>
+      </w:r>
+      <w:proofErr w:type="spellStart"/>
+      <w:r>
+        <w:rPr>
+          <w:b/>
+          <w:bCs/>
+        </w:rPr>
+        <w:t>lon</w:t>
+      </w:r>
+      <w:proofErr w:type="spellEnd"/>
+      <w:r>
+        <w:rPr>
+          <w:b/>
+          <w:bCs/>
+        </w:rPr>
+        <w:t>": 144.9648,</w:t>
+      </w:r>
+    </w:p>
+    <w:p>
+      <w:pPr>
+        <w:rPr>
+          <w:b/>
+          <w:bCs/>
+        </w:rPr>
+      </w:pPr>
+      <w:r>
+        <w:rPr>
+          <w:b/>
+          <w:bCs/>
+        </w:rPr>
+        <w:t xml:space="preserve">     "</w:t>
+      </w:r>
+      <w:proofErr w:type="spellStart"/>
+      <w:proofErr w:type="gramStart"/>
+      <w:r>
+        <w:rPr>
+          <w:b/>
+          <w:bCs/>
+        </w:rPr>
+        <w:t>nearest</w:t>
+      </w:r>
+      <w:proofErr w:type="gramEnd"/>
+      <w:r>
+        <w:rPr>
+          <w:b/>
+          <w:bCs/>
+        </w:rPr>
+        <w:t>_sensor_id</w:t>
+      </w:r>
+      <w:proofErr w:type="spellEnd"/>
+      <w:r>
+        <w:rPr>
+          <w:b/>
+          <w:bCs/>
+        </w:rPr>
+        <w:t>": 212, # confirmed from prefetch run</w:t>
+      </w:r>
+    </w:p>
+    <w:p>
+      <w:pPr>
+        <w:rPr>
+          <w:b/>
+          <w:bCs/>
+        </w:rPr>
+      </w:pPr>
+      <w:r>
+        <w:rPr>
+          <w:b/>
+          <w:bCs/>
+        </w:rPr>
+        <w:t xml:space="preserve">     "why": "Riverside arts/dining precinct; high footfall, microclimate sensors, venues."},</w:t>
+      </w:r>
+    </w:p>
+    <w:p>
+      <w:pPr>
+        <w:rPr>
+          <w:b/>
+          <w:bCs/>
+        </w:rPr>
+      </w:pPr>
+      <w:r>
+        <w:rPr>
+          <w:b/>
+          <w:bCs/>
+        </w:rPr>
+        <w:t>]</w:t>
+      </w:r>
+    </w:p>
+    <w:p>
+      <w:pPr>
+        <w:rPr>
+          <w:b/>
+          <w:bCs/>
+        </w:rPr>
+      </w:pPr>
+    </w:p>
+    <w:p>
+      <w:pPr>
+        <w:rPr>
+          <w:b/>
+          <w:bCs/>
+        </w:rPr>
+      </w:pPr>
+      <w:r>
+        <w:rPr>
+          <w:b/>
+          <w:bCs/>
+        </w:rPr>
+        <w:t># ---------------------------------------------------------------------------</w:t>
+      </w:r>
+    </w:p>
+    <w:p>
+      <w:pPr>
+        <w:rPr>
+          <w:b/>
+          <w:bCs/>
+        </w:rPr>
+      </w:pPr>
+      <w:r>
+        <w:rPr>
+          <w:b/>
+          <w:bCs/>
+        </w:rPr>
+        <w:t># Priority datasets. `id` is the best-known slug (verified where possible);</w:t>
+      </w:r>
+    </w:p>
+    <w:p>
+      <w:pPr>
+        <w:rPr>
+          <w:b/>
+          <w:bCs/>
+        </w:rPr>
+      </w:pPr>
+      <w:r>
+        <w:rPr>
+          <w:b/>
+          <w:bCs/>
+        </w:rPr>
+        <w:t># `kw` are fallback keywords used to resolve the real id from the catalogue if</w:t>
+      </w:r>
+    </w:p>
+    <w:p>
+      <w:pPr>
+        <w:rPr>
+          <w:b/>
+          <w:bCs/>
+        </w:rPr>
+      </w:pPr>
+      <w:r>
+        <w:rPr>
+          <w:b/>
+          <w:bCs/>
+        </w:rPr>
+        <w:t xml:space="preserve"># </w:t>
+      </w:r>
+      <w:proofErr w:type="gramStart"/>
+      <w:r>
+        <w:rPr>
+          <w:b/>
+          <w:bCs/>
+        </w:rPr>
+        <w:t>the</w:t>
+      </w:r>
+      <w:proofErr w:type="gramEnd"/>
+      <w:r>
+        <w:rPr>
+          <w:b/>
+          <w:bCs/>
+        </w:rPr>
+        <w:t xml:space="preserve"> slug 404s. `geo` = include in per-address proximity tests. `live` = also</w:t>
+      </w:r>
+    </w:p>
+    <w:p>
+      <w:pPr>
+        <w:rPr>
+          <w:b/>
+          <w:bCs/>
+        </w:rPr>
+      </w:pPr>
+      <w:r>
+        <w:rPr>
+          <w:b/>
+          <w:bCs/>
+        </w:rPr>
+        <w:t xml:space="preserve"># </w:t>
+      </w:r>
+      <w:proofErr w:type="gramStart"/>
+      <w:r>
+        <w:rPr>
+          <w:b/>
+          <w:bCs/>
+        </w:rPr>
+        <w:t>take</w:t>
+      </w:r>
+      <w:proofErr w:type="gramEnd"/>
+      <w:r>
+        <w:rPr>
+          <w:b/>
+          <w:bCs/>
+        </w:rPr>
+        <w:t xml:space="preserve"> a timestamped snapshot.</w:t>
+      </w:r>
+    </w:p>
+    <w:p>
+      <w:pPr>
+        <w:rPr>
+          <w:b/>
+          <w:bCs/>
+        </w:rPr>
+      </w:pPr>
+      <w:r>
+        <w:rPr>
+          <w:b/>
+          <w:bCs/>
+        </w:rPr>
+        <w:t># ---------------------------------------------------------------------------</w:t>
+      </w:r>
+    </w:p>
+    <w:p>
+      <w:pPr>
+        <w:rPr>
+          <w:b/>
+          <w:bCs/>
+        </w:rPr>
+      </w:pPr>
+      <w:r>
+        <w:rPr>
+          <w:b/>
+          <w:bCs/>
+        </w:rPr>
+        <w:t>DATASETS = [</w:t>
+      </w:r>
+    </w:p>
+    <w:p>
+      <w:pPr>
+        <w:rPr>
+          <w:b/>
+          <w:bCs/>
+        </w:rPr>
+      </w:pPr>
+      <w:r>
+        <w:rPr>
+          <w:b/>
+          <w:bCs/>
+        </w:rPr>
+        <w:t xml:space="preserve">    # ---- spatial backbone / most-connected hubs ----</w:t>
+      </w:r>
+    </w:p>
+    <w:p>
+      <w:pPr>
+        <w:rPr>
+          <w:b/>
+          <w:bCs/>
+        </w:rPr>
+      </w:pPr>
+      <w:r>
+        <w:rPr>
+          <w:b/>
+          <w:bCs/>
+        </w:rPr>
+        <w:t xml:space="preserve">    {"id": "blocks-for-census-of-land-use-and-employment-clue", "kw": ["clue", "blocks"], "geo": True},</w:t>
+      </w:r>
+    </w:p>
+    <w:p>
+      <w:pPr>
+        <w:rPr>
+          <w:b/>
+          <w:bCs/>
+        </w:rPr>
+      </w:pPr>
+      <w:r>
+        <w:rPr>
+          <w:b/>
+          <w:bCs/>
+        </w:rPr>
+        <w:t>... (380 lines left)</w:t>
       </w:r>
     </w:p>
     <w:p/>

</xml_diff>